<commit_message>
Reach 0.18.1: course passkey, plain talk, agent updates, --version
Call the class-wide enrollment secret the course passkey wherever a student
or agent reads it (--course-passkey, --course-code kept as an alias; the
wire contract is unchanged). Bind the persona to plain words for a new
computer user, with commands and rEach's workings kept out unless asked or
the student is known to be advanced. Have the agent update only through
reach update run --apply instead of hunting GitHub for a tagged ZIP. Add
reach version, --version and -V, working before enrollment.
</commit_message>
<xml_diff>
--- a/docs/INSTALLATION-AND-SETUP-GUIDE.docx
+++ b/docs/INSTALLATION-AND-SETUP-GUIDE.docx
@@ -277,7 +277,7 @@
                 <w:color w:val="1C2433"/>
                 <w:sz w:val="22"/>
               </w:rPr>
-              <w:t xml:space="preserve">   Enroll with your code</w:t>
+              <w:t xml:space="preserve">   Enroll with your passkey</w:t>
             </w:r>
           </w:p>
           <w:p>
@@ -293,7 +293,7 @@
                 <w:color w:val="5A6473"/>
                 <w:sz w:val="19"/>
               </w:rPr>
-              <w:t>Type your course code, username and student ID. rEach does the rest.</w:t>
+              <w:t>Type your course passkey, username and student ID. rEach does the rest.</w:t>
             </w:r>
           </w:p>
         </w:tc>
@@ -4708,7 +4708,7 @@
           <w:color w:val="1C2433"/>
           <w:sz w:val="21"/>
         </w:rPr>
-        <w:t xml:space="preserve">rEach’s “hooks” are small checks that Codex runs at set moments: when a chat starts and each time you send a message. They are how rEach greets you, asks for your enrollment code, and keeps your course work on track. Codex never runs a new plugin’s hooks until you review and trust them, so until you do this rEach stays silent.</w:t>
+        <w:t xml:space="preserve">rEach’s “hooks” are small checks that Codex runs at set moments: when a chat starts and each time you send a message. They are how rEach greets you, asks for your course passkey, and keeps your course work on track. Codex never runs a new plugin’s hooks until you review and trust them, so until you do this rEach stays silent.</w:t>
       </w:r>
     </w:p>
     <w:p>
@@ -4933,7 +4933,7 @@
           <w:color w:val="1C2433"/>
           <w:sz w:val="21"/>
         </w:rPr>
-        <w:t xml:space="preserve">Start another New chat. rEach should greet you and ask for your enrollment code (Step 3). If Codex answers like plain Codex instead, a hook is still untrusted. Open the review again.</w:t>
+        <w:t xml:space="preserve">Start another New chat. rEach should greet you and ask for your course passkey (Step 3). If Codex answers like plain Codex instead, a hook is still untrusted. Open the review again.</w:t>
       </w:r>
     </w:p>
     <w:p>
@@ -6149,7 +6149,7 @@
                 <w:color w:val="1C2433"/>
                 <w:sz w:val="20"/>
               </w:rPr>
-              <w:t xml:space="preserve">If rEach never greets you, or never asks for your enrollment code, your app is not running rEach’s hooks yet. Go back to the part above for your app. For Codex, that is B.</w:t>
+              <w:t xml:space="preserve">If rEach never greets you, or never asks for your course passkey, your app is not running rEach’s hooks yet. Go back to the part above for your app. For Codex, that is B.</w:t>
             </w:r>
           </w:p>
         </w:tc>
@@ -6244,7 +6244,7 @@
                 <w:color w:val="1F4E79"/>
                 <w:sz w:val="28"/>
               </w:rPr>
-              <w:t xml:space="preserve">Enroll with your course code</w:t>
+              <w:t xml:space="preserve">Enroll with your course passkey</w:t>
             </w:r>
           </w:p>
           <w:p>
@@ -6260,7 +6260,7 @@
                 <w:color w:val="5A6473"/>
                 <w:sz w:val="20"/>
               </w:rPr>
-              <w:t xml:space="preserve">Your course code connects rEach to your course, securely.</w:t>
+              <w:t xml:space="preserve">Your course passkey connects rEach to your course, securely.</w:t>
             </w:r>
           </w:p>
         </w:tc>
@@ -6289,7 +6289,7 @@
           <w:color w:val="1C2433"/>
           <w:sz w:val="21"/>
         </w:rPr>
-        <w:t xml:space="preserve">Start a new chat after rEach is installed. Before anything else, rEach greets you and asks for your enrollment code. Until you are enrolled, rEach runs this conversation itself. Your AI partner cannot see what you type here, and it won’t help with anything else yet.</w:t>
+        <w:t xml:space="preserve">Start a new chat after rEach is installed. Before anything else, rEach greets you and asks for your course passkey. Until you are enrolled, rEach runs this conversation itself. Your AI partner cannot see what you type here, and it won’t help with anything else yet.</w:t>
       </w:r>
     </w:p>
     <w:p>
@@ -6336,7 +6336,7 @@
           <w:color w:val="1C2433"/>
           <w:sz w:val="21"/>
         </w:rPr>
-        <w:t xml:space="preserve">course enrollment code</w:t>
+        <w:t xml:space="preserve">course passkey</w:t>
       </w:r>
       <w:r>
         <w:rPr>
@@ -6485,7 +6485,7 @@
           <w:color w:val="1C2433"/>
           <w:sz w:val="21"/>
         </w:rPr>
-        <w:t xml:space="preserve">Type your enrollment code. rEach shows the course name and term.</w:t>
+        <w:t xml:space="preserve">Type your course passkey. rEach shows the course name and term.</w:t>
       </w:r>
     </w:p>
     <w:p>
@@ -6660,7 +6660,7 @@
                 <w:color w:val="1F4E79"/>
                 <w:sz w:val="20"/>
               </w:rPr>
-              <w:t xml:space="preserve">About your code</w:t>
+              <w:t xml:space="preserve">About your passkey</w:t>
             </w:r>
           </w:p>
           <w:p>
@@ -6921,7 +6921,7 @@
           <w:color w:val="1C2433"/>
           <w:sz w:val="21"/>
         </w:rPr>
-        <w:t xml:space="preserve">To use a second computer, enroll there with the same code. Your instructor must approve it first. Once they have, type </w:t>
+        <w:t xml:space="preserve">To use a second computer, enroll there with the same passkey. Your instructor must approve it first. Once they have, type </w:t>
       </w:r>
       <w:r>
         <w:rPr>
@@ -7081,7 +7081,7 @@
           <w:color w:val="1C2433"/>
           <w:sz w:val="21"/>
         </w:rPr>
-        <w:t xml:space="preserve">rEach never greets you, or never asks for your code? Your app is not running rEach’s hooks yet. See </w:t>
+        <w:t xml:space="preserve">rEach never greets you, or never asks for your passkey? Your app is not running rEach’s hooks yet. See </w:t>
       </w:r>
       <w:r>
         <w:rPr>
@@ -7241,7 +7241,7 @@
           <w:color w:val="1C2433"/>
           <w:sz w:val="21"/>
         </w:rPr>
-        <w:t xml:space="preserve">I typed my course code, username and student ID, and rEach said I’m enrolled.</w:t>
+        <w:t xml:space="preserve">I typed my course passkey, username and student ID, and rEach said I’m enrolled.</w:t>
       </w:r>
     </w:p>
     <w:p>

</xml_diff>

<commit_message>
Docs: rebuild the setup guide for the current install, sign-in and privacy
The guide now installs from stable into ~/reach-work/.reach-home, sends Claude
desktop users to the Code tab, has Windows use rEach's own Ruby, adds the
password to enrollment and sign-in, describes the Codex reach-work setup and
states what is recorded. The assignment-one runbook's Codex pass takes the
course server from config and enrolls with the passkey.
</commit_message>
<xml_diff>
--- a/docs/INSTALLATION-AND-SETUP-GUIDE.docx
+++ b/docs/INSTALLATION-AND-SETUP-GUIDE.docx
@@ -45,7 +45,7 @@
           <w:szCs w:val="12"/>
           <w:shd w:fill="auto" w:val="clear"/>
         </w:rPr>
-        <w:t>https://github.com/SteveBenner/rEach/archive/refs/heads/main.zip</w:t>
+        <w:t>https://github.com/SteveBenner/rEach/archive/refs/heads/stable.zip</w:t>
       </w:r>
     </w:p>
     <w:p>
@@ -293,7 +293,7 @@
                 <w:color w:val="5A6473"/>
                 <w:sz w:val="19"/>
               </w:rPr>
-              <w:t>Type your course passkey, username and student ID. rEach does the rest.</w:t>
+              <w:t xml:space="preserve">Type your course passkey, username and student ID, and choose a password. rEach does the rest.</w:t>
             </w:r>
           </w:p>
         </w:tc>
@@ -640,7 +640,7 @@
                 <w:color w:val="1C2433"/>
                 <w:sz w:val="20"/>
               </w:rPr>
-              <w:t>Claude desktop app, in Cowork</w:t>
+              <w:t xml:space="preserve">Claude desktop app, in the Code tab</w:t>
             </w:r>
           </w:p>
         </w:tc>
@@ -1775,7 +1775,7 @@
           <w:color w:val="1F4E79"/>
           <w:sz w:val="26"/>
         </w:rPr>
-        <w:t>Option B — Claude: the Claude desktop app (Cowork)</w:t>
+        <w:t xml:space="preserve">Option B — Claude: the Claude desktop app (Code tab)</w:t>
       </w:r>
     </w:p>
     <w:p>
@@ -2127,7 +2127,7 @@
                 <w:color w:val="1C2433"/>
                 <w:sz w:val="20"/>
               </w:rPr>
-              <w:t>Requires Ubuntu 22.04 or newer, or Debian 12 or newer. Cowork on Linux also needs 8 GB of memory and about 25 GB of free disk space.</w:t>
+              <w:t xml:space="preserve">Requires Ubuntu 22.04 or newer, or Debian 12 or newer.</w:t>
             </w:r>
           </w:p>
           <w:p>
@@ -2269,7 +2269,7 @@
           <w:color w:val="1C2433"/>
           <w:sz w:val="21"/>
         </w:rPr>
-        <w:t>Choose Cowork in the message box. (In the newest version Cowork is built into Claude, so you may not see a separate button. Just start a new task.)</w:t>
+        <w:t xml:space="preserve">Click the &lt;/&gt; button at the top of the window to open the Code tab, and start a new session. Do your course work here, not in Cowork.</w:t>
       </w:r>
     </w:p>
     <w:tbl>
@@ -2321,7 +2321,7 @@
                 <w:color w:val="1C2433"/>
                 <w:sz w:val="20"/>
               </w:rPr>
-              <w:t xml:space="preserve">Cowork works inside a protected space, so it cannot install rEach onto your computer by itself. When you paste the Step 2 message, Claude will ask you to add rEach yourself. It takes four clicks: Customize › Plugins › Add › Add marketplace, paste </w:t>
+              <w:t xml:space="preserve">Use the Code tab for everything rEach does. In Cowork, rEach cannot sign you in, so it only asks you to switch to the Code tab.</w:t>
             </w:r>
             <w:r>
               <w:rPr>
@@ -2331,7 +2331,7 @@
                 <w:color w:val="1F4E79"/>
                 <w:sz w:val="18"/>
               </w:rPr>
-              <w:t>https://github.com/SteveBenner/rEach , add rEach, then start a new task.</w:t>
+              <w:t xml:space="preserve"/>
             </w:r>
           </w:p>
         </w:tc>
@@ -3503,7 +3503,7 @@
                 <w:color w:val="1F4E79"/>
                 <w:sz w:val="18"/>
               </w:rPr>
-              <w:t>~/.reach/bin/reach work --harness hermes . Write it down and always start your coursework with that exact command, not by typing hermes on its own. rEach only watches over your work when Hermes is started this way.</w:t>
+              <w:t xml:space="preserve">~/reach-work/.reach-home/bin/reach work --harness hermes . Write it down and always start your coursework with that exact command, not by typing hermes on its own. rEach only watches over your work when Hermes is started this way.</w:t>
             </w:r>
           </w:p>
         </w:tc>
@@ -3872,7 +3872,7 @@
                 <w:sz w:val="20"/>
                 <w:shd w:fill="FFFF00" w:val="clear"/>
               </w:rPr>
-              <w:t>https://github.com/SteveBenner/rEach/archive/refs/heads/main.zip</w:t>
+              <w:t>https://github.com/SteveBenner/rEach/archive/refs/heads/stable.zip</w:t>
             </w:r>
           </w:p>
           <w:p>
@@ -3995,7 +3995,7 @@
           <w:color w:val="1C2433"/>
           <w:sz w:val="21"/>
         </w:rPr>
-        <w:t>rEach runs on Ruby, a free programming tool. Macs already have it. On Windows or Linux your AI partner may ask to install it. Say yes.</w:t>
+        <w:t xml:space="preserve">rEach runs on Ruby, a free programming tool. If your computer doesn’t have it, rEach downloads its own copy for you, with no administrator rights. There is nothing to approve for it.</w:t>
       </w:r>
     </w:p>
     <w:p>
@@ -4017,27 +4017,6 @@
           <w:sz w:val="21"/>
         </w:rPr>
         <w:t>You are done when it says “rEach is installed and ready.” It may then tell you one more thing to do, such as starting a new session, or trusting rEach’s hooks in Codex. Do what it says.</w:t>
-      </w:r>
-    </w:p>
-    <w:p>
-      <w:pPr>
-        <w:pStyle w:val="ListBullet"/>
-        <w:numPr>
-          <w:ilvl w:val="0"/>
-          <w:numId w:val="1"/>
-        </w:numPr>
-        <w:spacing w:lineRule="auto" w:line="276" w:before="0" w:after="60"/>
-        <w:contextualSpacing/>
-        <w:rPr/>
-      </w:pPr>
-      <w:r>
-        <w:rPr>
-          <w:b w:val="false"/>
-          <w:i w:val="false"/>
-          <w:color w:val="1C2433"/>
-          <w:sz w:val="21"/>
-        </w:rPr>
-        <w:t>Claude Cowork users: follow the four clicks Claude gives you (see Option B).</w:t>
       </w:r>
     </w:p>
     <w:p>
@@ -4104,7 +4083,7 @@
           <w:color w:val="5A6473"/>
           <w:sz w:val="17"/>
         </w:rPr>
-        <w:t>The rEach project on GitHub. You do not need to visit it: your AI partner downloads it for you. Cowork users paste this page’s address when adding rEach.</w:t>
+        <w:t xml:space="preserve">The rEach project on GitHub. You do not need to visit it: your AI partner downloads it for you.</w:t>
       </w:r>
     </w:p>
     <w:p>
@@ -4279,7 +4258,7 @@
           <w:color w:val="1C2433"/>
           <w:sz w:val="21"/>
         </w:rPr>
-        <w:t xml:space="preserve">First read the one-sentence explanation your AI partner gives. It should match what you asked for: downloading rEach and installing it into a folder named .reach in your home folder.</w:t>
+        <w:t xml:space="preserve">First read the one-sentence explanation your AI partner gives. It should match what you asked for: downloading rEach and installing it into the reach-work folder in your home folder.</w:t>
       </w:r>
     </w:p>
     <w:p>
@@ -4300,7 +4279,7 @@
           <w:color w:val="1C2433"/>
           <w:sz w:val="21"/>
         </w:rPr>
-        <w:t xml:space="preserve">Approve requests that mention rEach, </w:t>
+        <w:t xml:space="preserve">Approve requests that mention rEach, reach-work,</w:t>
       </w:r>
       <w:r>
         <w:rPr>
@@ -4310,7 +4289,7 @@
           <w:color w:val="1F4E79"/>
           <w:sz w:val="19"/>
         </w:rPr>
-        <w:t xml:space="preserve">.reach</w:t>
+        <w:t xml:space="preserve"/>
       </w:r>
       <w:r>
         <w:rPr>
@@ -4319,7 +4298,7 @@
           <w:color w:val="1C2433"/>
           <w:sz w:val="21"/>
         </w:rPr>
-        <w:t xml:space="preserve">, </w:t>
+        <w:t xml:space="preserve"> </w:t>
       </w:r>
       <w:r>
         <w:rPr>
@@ -4496,7 +4475,7 @@
           <w:color w:val="1C2433"/>
           <w:sz w:val="21"/>
         </w:rPr>
-        <w:t xml:space="preserve">Codex runs commands in a protected space, its sandbox, with no internet. Installing rEach needs the internet and writes to the .reach folder in your home folder, so Codex asks your permission to run the install command outside the sandbox.</w:t>
+        <w:t xml:space="preserve">Codex runs commands in a protected space, its sandbox, with no internet. Installing rEach needs the internet and writes to the reach-work folder in your home folder, so Codex asks your permission to run the install command outside the sandbox.</w:t>
       </w:r>
     </w:p>
     <w:p>
@@ -4532,7 +4511,7 @@
           <w:color w:val="1F4E79"/>
           <w:sz w:val="19"/>
         </w:rPr>
-        <w:t xml:space="preserve">mkdir -p ~/.reach/bootstrap</w:t>
+        <w:t xml:space="preserve">mkdir -p ~/reach-work/.reach-home/bootstrap</w:t>
       </w:r>
       <w:r>
         <w:rPr>
@@ -4657,7 +4636,7 @@
           <w:color w:val="1C2433"/>
           <w:sz w:val="21"/>
         </w:rPr>
-        <w:t xml:space="preserve">If Codex cannot leave its sandbox, your AI partner asks you to change the chat’s permissions. This happens on Windows, where the install stops with “access denied” on .reach. Open the permissions menu under the message box (it may read “Ask for approval” or “Default permissions”), choose </w:t>
+        <w:t xml:space="preserve">If Codex cannot leave its sandbox, your AI partner asks you to change the chat’s permissions. This happens on Windows, where the install stops with “access denied” on reach-work. Open the permissions menu under the message box (it may read “Ask for approval” or “Default permissions”), choose </w:t>
       </w:r>
       <w:r>
         <w:rPr>
@@ -5022,7 +5001,7 @@
           <w:color w:val="1C2433"/>
           <w:sz w:val="21"/>
         </w:rPr>
-        <w:t xml:space="preserve">C.  Trust each course folder once</w:t>
+        <w:t xml:space="preserve">C.  Open your reach-work folder and let rEach set up Codex</w:t>
       </w:r>
     </w:p>
     <w:p>
@@ -5038,7 +5017,7 @@
           <w:color w:val="1C2433"/>
           <w:sz w:val="21"/>
         </w:rPr>
-        <w:t xml:space="preserve">After you enroll, rEach makes a folder for each part of your course work. Each folder has its own rEach settings and checks. The first time you open one of these folders in Codex, Codex may ask whether you trust the folder, and ask you to review that folder’s hooks. Trust the folder, and trust the hooks whose commands run reach. You do this once per folder.</w:t>
+        <w:t xml:space="preserve">In Codex, open the reach-work folder in your home folder as the chat’s folder. rEach then asks once whether it may change two of Codex’s settings, so Codex can reach your course server and save your work in that folder. It saves a copy of your old settings first. Say yes, then start a new chat.</w:t>
       </w:r>
     </w:p>
     <w:p>
@@ -5219,202 +5198,6 @@
           <w:sz w:val="21"/>
         </w:rPr>
         <w:t xml:space="preserve">The first time you open one of your course folders, Claude asks whether you trust the files in this folder. Say yes for your course folders. Claude runs rEach’s hooks without a separate review, so there is nothing else to trust.</w:t>
-      </w:r>
-    </w:p>
-    <w:p>
-      <w:pPr>
-        <w:pStyle w:val="Normal"/>
-        <w:keepNext w:val="true"/>
-        <w:spacing w:before="160" w:after="40"/>
-        <w:rPr/>
-      </w:pPr>
-      <w:r>
-        <w:rPr>
-          <w:b/>
-          <w:i w:val="false"/>
-          <w:color w:val="1F4E79"/>
-          <w:sz w:val="26"/>
-        </w:rPr>
-        <w:t xml:space="preserve">If you use Claude Cowork</w:t>
-      </w:r>
-    </w:p>
-    <w:p>
-      <w:pPr>
-        <w:pStyle w:val="Normal"/>
-        <w:spacing w:lineRule="auto" w:line="276" w:before="0" w:after="80"/>
-        <w:rPr/>
-      </w:pPr>
-      <w:r>
-        <w:rPr>
-          <w:b w:val="false"/>
-          <w:i w:val="false"/>
-          <w:color w:val="1C2433"/>
-          <w:sz w:val="21"/>
-        </w:rPr>
-        <w:t xml:space="preserve">Cowork cannot install rEach by itself, so you add it with four clicks: open </w:t>
-      </w:r>
-      <w:r>
-        <w:rPr>
-          <w:b/>
-          <w:i w:val="false"/>
-          <w:color w:val="1C2433"/>
-          <w:sz w:val="21"/>
-        </w:rPr>
-        <w:t xml:space="preserve">Customize</w:t>
-      </w:r>
-      <w:r>
-        <w:rPr>
-          <w:b w:val="false"/>
-          <w:i w:val="false"/>
-          <w:color w:val="1C2433"/>
-          <w:sz w:val="21"/>
-        </w:rPr>
-        <w:t xml:space="preserve"> in the sidebar, then </w:t>
-      </w:r>
-      <w:r>
-        <w:rPr>
-          <w:b/>
-          <w:i w:val="false"/>
-          <w:color w:val="1C2433"/>
-          <w:sz w:val="21"/>
-        </w:rPr>
-        <w:t xml:space="preserve">Plugins</w:t>
-      </w:r>
-      <w:r>
-        <w:rPr>
-          <w:b w:val="false"/>
-          <w:i w:val="false"/>
-          <w:color w:val="1C2433"/>
-          <w:sz w:val="21"/>
-        </w:rPr>
-        <w:t xml:space="preserve">, then </w:t>
-      </w:r>
-      <w:r>
-        <w:rPr>
-          <w:b/>
-          <w:i w:val="false"/>
-          <w:color w:val="1C2433"/>
-          <w:sz w:val="21"/>
-        </w:rPr>
-        <w:t xml:space="preserve">Add marketplace</w:t>
-      </w:r>
-      <w:r>
-        <w:rPr>
-          <w:b w:val="false"/>
-          <w:i w:val="false"/>
-          <w:color w:val="1C2433"/>
-          <w:sz w:val="21"/>
-        </w:rPr>
-        <w:t xml:space="preserve">. Paste </w:t>
-      </w:r>
-      <w:r>
-        <w:rPr>
-          <w:rFonts w:eastAsia="Consolas" w:ascii="Consolas" w:hAnsi="Consolas"/>
-          <w:b w:val="false"/>
-          <w:i w:val="false"/>
-          <w:color w:val="1F4E79"/>
-          <w:sz w:val="19"/>
-        </w:rPr>
-        <w:t xml:space="preserve">https://github.com/SteveBenner/rEach</w:t>
-      </w:r>
-      <w:r>
-        <w:rPr>
-          <w:b w:val="false"/>
-          <w:i w:val="false"/>
-          <w:color w:val="1C2433"/>
-          <w:sz w:val="21"/>
-        </w:rPr>
-        <w:t xml:space="preserve">, choose rEach, click </w:t>
-      </w:r>
-      <w:r>
-        <w:rPr>
-          <w:b/>
-          <w:i w:val="false"/>
-          <w:color w:val="1C2433"/>
-          <w:sz w:val="21"/>
-        </w:rPr>
-        <w:t xml:space="preserve">Install</w:t>
-      </w:r>
-      <w:r>
-        <w:rPr>
-          <w:b w:val="false"/>
-          <w:i w:val="false"/>
-          <w:color w:val="1C2433"/>
-          <w:sz w:val="21"/>
-        </w:rPr>
-        <w:t xml:space="preserve">, then start a new task.</w:t>
-      </w:r>
-    </w:p>
-    <w:p>
-      <w:pPr>
-        <w:pStyle w:val="Normal"/>
-        <w:keepNext w:val="true"/>
-        <w:spacing w:before="120" w:after="40"/>
-        <w:jc w:val="center"/>
-        <w:rPr/>
-      </w:pPr>
-      <w:r>
-        <w:rPr/>
-        <w:drawing>
-          <wp:inline distT="0" distB="0" distL="0" distR="0">
-            <wp:extent cx="3413759" cy="3931920"/>
-            <wp:effectExtent l="0" t="0" r="0" b="0"/>
-            <wp:docPr id="51" name="Picture 51" descr="Anthropic’s instructions for adding a plugin marketplace in Cowork (claude.com/docs/cowork/guide/plugins). For rEach, the address to paste is https://github.com/SteveBenner/rEach."/>
-            <wp:cNvGraphicFramePr>
-              <a:graphicFrameLocks xmlns:a="http://schemas.openxmlformats.org/drawingml/2006/main" noChangeAspect="1"/>
-            </wp:cNvGraphicFramePr>
-            <a:graphic xmlns:a="http://schemas.openxmlformats.org/drawingml/2006/main">
-              <a:graphicData uri="http://schemas.openxmlformats.org/drawingml/2006/picture">
-                <pic:pic xmlns:pic="http://schemas.openxmlformats.org/drawingml/2006/picture">
-                  <pic:nvPicPr>
-                    <pic:cNvPr id="51" name="Picture 51"/>
-                    <pic:cNvPicPr>
-                      <a:picLocks noChangeAspect="1" noChangeArrowheads="1"/>
-                    </pic:cNvPicPr>
-                  </pic:nvPicPr>
-                  <pic:blipFill>
-                    <a:blip r:embed="rId101"/>
-                    <a:stretch>
-                      <a:fillRect/>
-                    </a:stretch>
-                  </pic:blipFill>
-                  <pic:spPr bwMode="auto">
-                    <a:xfrm>
-                      <a:off x="0" y="0"/>
-                      <a:ext cx="3413759" cy="3931920"/>
-                    </a:xfrm>
-                    <a:prstGeom prst="rect">
-                      <a:avLst/>
-                    </a:prstGeom>
-                    <a:noFill/>
-                    <a:ln w="6350">
-                      <a:solidFill>
-                        <a:srgbClr val="C9D2DC"/>
-                      </a:solidFill>
-                    </a:ln>
-                  </pic:spPr>
-                </pic:pic>
-              </a:graphicData>
-            </a:graphic>
-          </wp:inline>
-        </w:drawing>
-      </w:r>
-    </w:p>
-    <w:p>
-      <w:pPr>
-        <w:pStyle w:val="Normal"/>
-        <w:spacing w:lineRule="auto" w:line="276" w:before="0" w:after="200"/>
-        <w:jc w:val="center"/>
-        <w:rPr/>
-      </w:pPr>
-      <w:r>
-        <w:rPr>
-          <w:b w:val="false"/>
-          <w:i/>
-          <w:color w:val="5A6473"/>
-          <w:sz w:val="17"/>
-        </w:rPr>
-        <w:t xml:space="preserve">Anthropic’s instructions for adding a plugin marketplace in Cowork (claude.com/docs/cowork/guide/plugins). For rEach, the address to paste is https://github.com/SteveBenner/rEach.</w:t>
       </w:r>
     </w:p>
     <w:p>
@@ -5619,7 +5402,7 @@
           <w:color w:val="1F4E79"/>
           <w:sz w:val="19"/>
         </w:rPr>
-        <w:t xml:space="preserve">~/.reach/bin/reach work --harness hermes</w:t>
+        <w:t xml:space="preserve">~/reach-work/.reach-home/bin/reach work --harness hermes</w:t>
       </w:r>
       <w:r>
         <w:rPr>
@@ -5776,7 +5559,7 @@
           <w:color w:val="1C2433"/>
           <w:sz w:val="21"/>
         </w:rPr>
-        <w:t xml:space="preserve">If your app asks to use your Documents folder (“… would like to access files in your Documents folder”), click Allow. Your course folders live there.</w:t>
+        <w:t xml:space="preserve">If your app asks to use your Documents folder (“… would like to access files in your Documents folder”), click Allow.</w:t>
       </w:r>
     </w:p>
     <w:p>
@@ -5886,7 +5669,7 @@
           <w:color w:val="1C2433"/>
           <w:sz w:val="21"/>
         </w:rPr>
-        <w:t xml:space="preserve">rEach runs on Ruby. If Ruby isn’t on your PC, your AI partner asks whether it may install Ruby 4.0 from rubyinstaller.org, for you only. Say yes.</w:t>
+        <w:t xml:space="preserve">rEach runs on Ruby. If Ruby isn’t on your PC, rEach’s installer downloads its own copy into your reach-work folder, for you only, with no administrator rights. Don’t install Ruby yourself.</w:t>
       </w:r>
     </w:p>
     <w:p>
@@ -5907,100 +5690,7 @@
           <w:color w:val="1C2433"/>
           <w:sz w:val="21"/>
         </w:rPr>
-        <w:t xml:space="preserve">If it asks you to run the installer yourself, download Ruby+Devkit 4.0 (x64) (the one marked =&gt;), or the (arm) one on a Snapdragon PC. Open the file, choose “Install for me only”, and keep the other defaults. Then close your AI app and open it again so it finds Ruby.</w:t>
-      </w:r>
-    </w:p>
-    <w:p>
-      <w:pPr>
-        <w:pStyle w:val="Normal"/>
-        <w:keepNext w:val="true"/>
-        <w:spacing w:before="120" w:after="40"/>
-        <w:jc w:val="center"/>
-        <w:rPr/>
-      </w:pPr>
-      <w:r>
-        <w:rPr/>
-        <w:drawing>
-          <wp:inline distT="0" distB="0" distL="0" distR="0">
-            <wp:extent cx="5120640" cy="3200399"/>
-            <wp:effectExtent l="0" t="0" r="0" b="0"/>
-            <wp:docPr id="55" name="Picture 55" descr="The RubyInstaller downloads page (rubyinstaller.org/downloads). The recommended installer is marked with =&gt;."/>
-            <wp:cNvGraphicFramePr>
-              <a:graphicFrameLocks xmlns:a="http://schemas.openxmlformats.org/drawingml/2006/main" noChangeAspect="1"/>
-            </wp:cNvGraphicFramePr>
-            <a:graphic xmlns:a="http://schemas.openxmlformats.org/drawingml/2006/main">
-              <a:graphicData uri="http://schemas.openxmlformats.org/drawingml/2006/picture">
-                <pic:pic xmlns:pic="http://schemas.openxmlformats.org/drawingml/2006/picture">
-                  <pic:nvPicPr>
-                    <pic:cNvPr id="55" name="Picture 55"/>
-                    <pic:cNvPicPr>
-                      <a:picLocks noChangeAspect="1" noChangeArrowheads="1"/>
-                    </pic:cNvPicPr>
-                  </pic:nvPicPr>
-                  <pic:blipFill>
-                    <a:blip r:embed="rId105"/>
-                    <a:stretch>
-                      <a:fillRect/>
-                    </a:stretch>
-                  </pic:blipFill>
-                  <pic:spPr bwMode="auto">
-                    <a:xfrm>
-                      <a:off x="0" y="0"/>
-                      <a:ext cx="5120640" cy="3200399"/>
-                    </a:xfrm>
-                    <a:prstGeom prst="rect">
-                      <a:avLst/>
-                    </a:prstGeom>
-                    <a:noFill/>
-                    <a:ln w="6350">
-                      <a:solidFill>
-                        <a:srgbClr val="C9D2DC"/>
-                      </a:solidFill>
-                    </a:ln>
-                  </pic:spPr>
-                </pic:pic>
-              </a:graphicData>
-            </a:graphic>
-          </wp:inline>
-        </w:drawing>
-      </w:r>
-    </w:p>
-    <w:p>
-      <w:pPr>
-        <w:pStyle w:val="Normal"/>
-        <w:spacing w:lineRule="auto" w:line="276" w:before="0" w:after="200"/>
-        <w:jc w:val="center"/>
-        <w:rPr/>
-      </w:pPr>
-      <w:r>
-        <w:rPr>
-          <w:b w:val="false"/>
-          <w:i/>
-          <w:color w:val="5A6473"/>
-          <w:sz w:val="17"/>
-        </w:rPr>
-        <w:t xml:space="preserve">The RubyInstaller downloads page (rubyinstaller.org/downloads). The recommended installer is marked with =&gt;.</w:t>
-      </w:r>
-    </w:p>
-    <w:p>
-      <w:pPr>
-        <w:pStyle w:val="ListBullet"/>
-        <w:numPr>
-          <w:ilvl w:val="0"/>
-          <w:numId w:val="1"/>
-        </w:numPr>
-        <w:spacing w:lineRule="auto" w:line="276" w:before="0" w:after="60"/>
-        <w:contextualSpacing/>
-        <w:rPr/>
-      </w:pPr>
-      <w:r>
-        <w:rPr>
-          <w:b w:val="false"/>
-          <w:i w:val="false"/>
-          <w:color w:val="1C2433"/>
-          <w:sz w:val="21"/>
-        </w:rPr>
-        <w:t xml:space="preserve">If Windows shows “Windows protected your PC” for a file from the official addresses in this handout, click More info and check the publisher (OpenAI, Anthropic, Google or RubyInstaller). Only then click Run anyway. If it names any other publisher, stop and ask your instructor.</w:t>
+        <w:t xml:space="preserve">If Windows shows “Windows protected your PC” for a file from the official addresses in this handout, click More info and check the publisher (OpenAI, Anthropic or Google). Only then click Run anyway. If it names any other publisher, stop and ask your instructor.</w:t>
       </w:r>
     </w:p>
     <w:p>
@@ -6306,7 +5996,7 @@
           <w:color w:val="1C2433"/>
           <w:sz w:val="21"/>
         </w:rPr>
-        <w:t xml:space="preserve">Have these three things ready</w:t>
+        <w:t xml:space="preserve">Have these things ready</w:t>
       </w:r>
     </w:p>
     <w:p>
@@ -6602,6 +6292,70 @@
           <w:sz w:val="21"/>
         </w:rPr>
         <w:t xml:space="preserve"> to start over.</w:t>
+      </w:r>
+    </w:p>
+    <w:p>
+      <w:pPr>
+        <w:pStyle w:val="Normal"/>
+        <w:spacing w:lineRule="auto" w:line="276" w:before="0" w:after="60"/>
+        <w:ind w:hanging="317" w:start="432"/>
+        <w:rPr/>
+      </w:pPr>
+      <w:r>
+        <w:rPr>
+          <w:b/>
+          <w:i w:val="false"/>
+          <w:color w:val="1F4E79"/>
+          <w:sz w:val="21"/>
+        </w:rPr>
+        <w:t xml:space="preserve">5.  </w:t>
+      </w:r>
+      <w:r>
+        <w:rPr>
+          <w:b w:val="false"/>
+          <w:i w:val="false"/>
+          <w:color w:val="1C2433"/>
+          <w:sz w:val="21"/>
+        </w:rPr>
+        <w:t xml:space="preserve">Choose a password of at least 8 characters and type it twice. Write it down: you type it every time you sign in, and nobody can look it up for you.</w:t>
+      </w:r>
+      <w:r>
+        <w:rPr>
+          <w:rFonts w:eastAsia="Consolas" w:ascii="Consolas" w:hAnsi="Consolas"/>
+          <w:b w:val="false"/>
+          <w:i w:val="false"/>
+          <w:color w:val="1F4E79"/>
+          <w:sz w:val="19"/>
+        </w:rPr>
+        <w:t xml:space="preserve"/>
+      </w:r>
+      <w:r>
+        <w:rPr>
+          <w:b w:val="false"/>
+          <w:i w:val="false"/>
+          <w:color w:val="1C2433"/>
+          <w:sz w:val="21"/>
+        </w:rPr>
+        <w:t xml:space="preserve"/>
+      </w:r>
+      <w:r>
+        <w:rPr>
+          <w:rFonts w:eastAsia="Consolas" w:ascii="Consolas" w:hAnsi="Consolas"/>
+          <w:b w:val="false"/>
+          <w:i w:val="false"/>
+          <w:color w:val="1F4E79"/>
+          <w:sz w:val="19"/>
+        </w:rPr>
+        <w:t xml:space="preserve"/>
+      </w:r>
+      <w:r>
+        <w:rPr>
+          <w:b w:val="false"/>
+          <w:i w:val="false"/>
+          <w:color w:val="1C2433"/>
+          <w:sz w:val="21"/>
+        </w:rPr>
+        <w:t xml:space="preserve"/>
       </w:r>
     </w:p>
     <w:p>
@@ -6860,7 +6614,7 @@
           <w:color w:val="1C2433"/>
           <w:sz w:val="21"/>
         </w:rPr>
-        <w:t xml:space="preserve">Each new session starts with sign-in. rEach asks for your student ID, then asks “Am I speaking with …?”. Type </w:t>
+        <w:t xml:space="preserve">Each new session starts with sign-in. rEach asks for your student ID, then asks “Am I speaking with …?”. Type yes, then type your rEach password. Your AI partner never sees your ID or your password. Forgot the password? Type forgot password, ask your instructor to allow a reset, then type forgot password again and choose a new one.</w:t>
       </w:r>
       <w:r>
         <w:rPr>
@@ -6870,7 +6624,7 @@
           <w:color w:val="1F4E79"/>
           <w:sz w:val="19"/>
         </w:rPr>
-        <w:t xml:space="preserve">yes</w:t>
+        <w:t xml:space="preserve"/>
       </w:r>
       <w:r>
         <w:rPr>
@@ -6879,7 +6633,7 @@
           <w:color w:val="1C2433"/>
           <w:sz w:val="21"/>
         </w:rPr>
-        <w:t xml:space="preserve">. Your AI partner never sees your ID.</w:t>
+        <w:t xml:space="preserve"/>
       </w:r>
     </w:p>
     <w:p>
@@ -6961,7 +6715,7 @@
           <w:color w:val="1C2433"/>
           <w:sz w:val="21"/>
         </w:rPr>
-        <w:t xml:space="preserve">rEach keeps no record of your conversations, in any folder. Your instructor receives only the work you submit, your answers about your own part, and help requests you agree to send. rEach’s memory on your computer learns from what you type so it can help you better; it never leaves your computer. Files in your extracurricular folder stay on your computer too.</w:t>
+        <w:t xml:space="preserve">While you are signed in and working on an assignment, rEach records the conversation and sends it to your instructor without your name on it. Nothing is recorded before you sign in, in your extracurricular folder or outside your course folder. rEach also sends the work you submit, your answers about your own part, and help requests you agree to send. rEach’s memory on your computer learns from what you type so it can help you better; it never leaves your computer. Files in your extracurricular folder stay on your computer too.</w:t>
       </w:r>
     </w:p>
     <w:p>
@@ -6982,7 +6736,7 @@
           <w:color w:val="1C2433"/>
           <w:sz w:val="21"/>
         </w:rPr>
-        <w:t xml:space="preserve">Codex users: trust each course folder and its hooks the first time you open it (C on the extra-steps page).</w:t>
+        <w:t xml:space="preserve">Codex users: open the reach-work folder as the chat’s folder and say yes to rEach’s Codex settings (C on the extra-steps page).</w:t>
       </w:r>
     </w:p>
     <w:p>
@@ -7241,7 +6995,7 @@
           <w:color w:val="1C2433"/>
           <w:sz w:val="21"/>
         </w:rPr>
-        <w:t xml:space="preserve">I typed my course passkey, username and student ID, and rEach said I’m enrolled.</w:t>
+        <w:t xml:space="preserve">I typed my course passkey, username and student ID, chose a password, and rEach said I’m enrolled.</w:t>
       </w:r>
     </w:p>
     <w:p>

</xml_diff>